<commit_message>
Java Performance: update chap 1
</commit_message>
<xml_diff>
--- a/Java-Performance/1.docx
+++ b/Java-Performance/1.docx
@@ -1,6 +1,6 @@
 
 <file path=word/document.xml><?xml version="1.0" encoding="utf-8"?>
-<w:document xmlns:wpc="http://schemas.microsoft.com/office/word/2010/wordprocessingCanvas" xmlns:cx="http://schemas.microsoft.com/office/drawing/2014/chartex" xmlns:cx1="http://schemas.microsoft.com/office/drawing/2015/9/8/chartex" xmlns:cx2="http://schemas.microsoft.com/office/drawing/2015/10/21/chartex" xmlns:cx3="http://schemas.microsoft.com/office/drawing/2016/5/9/chartex" xmlns:cx4="http://schemas.microsoft.com/office/drawing/2016/5/10/chartex" xmlns:cx5="http://schemas.microsoft.com/office/drawing/2016/5/11/chartex" xmlns:cx6="http://schemas.microsoft.com/office/drawing/2016/5/12/chartex" xmlns:cx7="http://schemas.microsoft.com/office/drawing/2016/5/13/chartex" xmlns:cx8="http://schemas.microsoft.com/office/drawing/2016/5/14/chartex" xmlns:mc="http://schemas.openxmlformats.org/markup-compatibility/2006" xmlns:aink="http://schemas.microsoft.com/office/drawing/2016/ink" xmlns:am3d="http://schemas.microsoft.com/office/drawing/2017/model3d" xmlns:o="urn:schemas-microsoft-com:office:office" xmlns:oel="http://schemas.microsoft.com/office/2019/extlst" xmlns:r="http://schemas.openxmlformats.org/officeDocument/2006/relationships" xmlns:m="http://schemas.openxmlformats.org/officeDocument/2006/math" xmlns:v="urn:schemas-microsoft-com:vml" xmlns:wp14="http://schemas.microsoft.com/office/word/2010/wordprocessingDrawing" xmlns:wp="http://schemas.openxmlformats.org/drawingml/2006/wordprocessingDrawing" xmlns:w10="urn:schemas-microsoft-com:office:word" xmlns:w="http://schemas.openxmlformats.org/wordprocessingml/2006/main" xmlns:w14="http://schemas.microsoft.com/office/word/2010/wordml" xmlns:w15="http://schemas.microsoft.com/office/word/2012/wordml" xmlns:w16cex="http://schemas.microsoft.com/office/word/2018/wordml/cex" xmlns:w16cid="http://schemas.microsoft.com/office/word/2016/wordml/cid" xmlns:w16="http://schemas.microsoft.com/office/word/2018/wordml" xmlns:w16du="http://schemas.microsoft.com/office/word/2023/wordml/word16du" xmlns:w16sdtdh="http://schemas.microsoft.com/office/word/2020/wordml/sdtdatahash" xmlns:w16sdtfl="http://schemas.microsoft.com/office/word/2024/wordml/sdtformatlock" xmlns:w16se="http://schemas.microsoft.com/office/word/2015/wordml/symex" xmlns:wpg="http://schemas.microsoft.com/office/word/2010/wordprocessingGroup" xmlns:wpi="http://schemas.microsoft.com/office/word/2010/wordprocessingInk" xmlns:wne="http://schemas.microsoft.com/office/word/2006/wordml" xmlns:wps="http://schemas.microsoft.com/office/word/2010/wordprocessingShape" mc:Ignorable="w14 w15 w16se w16cid w16 w16cex w16sdtdh w16sdtfl w16du wp14">
+<w:document xmlns:wpc="http://schemas.microsoft.com/office/word/2010/wordprocessingCanvas" xmlns:cx="http://schemas.microsoft.com/office/drawing/2014/chartex" xmlns:cx1="http://schemas.microsoft.com/office/drawing/2015/9/8/chartex" xmlns:cx2="http://schemas.microsoft.com/office/drawing/2015/10/21/chartex" xmlns:cx3="http://schemas.microsoft.com/office/drawing/2016/5/9/chartex" xmlns:cx4="http://schemas.microsoft.com/office/drawing/2016/5/10/chartex" xmlns:cx5="http://schemas.microsoft.com/office/drawing/2016/5/11/chartex" xmlns:cx6="http://schemas.microsoft.com/office/drawing/2016/5/12/chartex" xmlns:cx7="http://schemas.microsoft.com/office/drawing/2016/5/13/chartex" xmlns:cx8="http://schemas.microsoft.com/office/drawing/2016/5/14/chartex" xmlns:mc="http://schemas.openxmlformats.org/markup-compatibility/2006" xmlns:aink="http://schemas.microsoft.com/office/drawing/2016/ink" xmlns:am3d="http://schemas.microsoft.com/office/drawing/2017/model3d" xmlns:o="urn:schemas-microsoft-com:office:office" xmlns:oel="http://schemas.microsoft.com/office/2019/extlst" xmlns:r="http://schemas.openxmlformats.org/officeDocument/2006/relationships" xmlns:m="http://schemas.openxmlformats.org/officeDocument/2006/math" xmlns:v="urn:schemas-microsoft-com:vml" xmlns:wp14="http://schemas.microsoft.com/office/word/2010/wordprocessingDrawing" xmlns:wp="http://schemas.openxmlformats.org/drawingml/2006/wordprocessingDrawing" xmlns:w10="urn:schemas-microsoft-com:office:word" xmlns:w="http://schemas.openxmlformats.org/wordprocessingml/2006/main" xmlns:w14="http://schemas.microsoft.com/office/word/2010/wordml" xmlns:w15="http://schemas.microsoft.com/office/word/2012/wordml" xmlns:w16cei="http://schemas.microsoft.com/office/word/2026/wordml/cei" xmlns:w16cex="http://schemas.microsoft.com/office/word/2018/wordml/cex" xmlns:w16cid="http://schemas.microsoft.com/office/word/2016/wordml/cid" xmlns:w16="http://schemas.microsoft.com/office/word/2018/wordml" xmlns:w16du="http://schemas.microsoft.com/office/word/2023/wordml/word16du" xmlns:w16sdtdh="http://schemas.microsoft.com/office/word/2020/wordml/sdtdatahash" xmlns:w16sdtfl="http://schemas.microsoft.com/office/word/2024/wordml/sdtformatlock" xmlns:w16se="http://schemas.microsoft.com/office/word/2015/wordml/symex" xmlns:wpg="http://schemas.microsoft.com/office/word/2010/wordprocessingGroup" xmlns:wpi="http://schemas.microsoft.com/office/word/2010/wordprocessingInk" xmlns:wne="http://schemas.microsoft.com/office/word/2006/wordml" xmlns:wps="http://schemas.microsoft.com/office/word/2010/wordprocessingShape" mc:Ignorable="w14 w15 w16se w16cid w16 w16cex w16sdtdh w16sdtfl w16du wp14">
   <w:body>
     <w:p>
       <w:pPr>
@@ -27,6 +27,80 @@
           <w:szCs w:val="32"/>
         </w:rPr>
       </w:pPr>
+      <w:r>
+        <w:rPr>
+          <w:sz w:val="32"/>
+          <w:szCs w:val="32"/>
+        </w:rPr>
+        <w:t>-The goal is to give in-depth understanding of performance aspects of Java platform.</w:t>
+      </w:r>
+    </w:p>
+    <w:p>
+      <w:pPr>
+        <w:rPr>
+          <w:sz w:val="32"/>
+          <w:szCs w:val="32"/>
+        </w:rPr>
+      </w:pPr>
+      <w:r>
+        <w:rPr>
+          <w:sz w:val="32"/>
+          <w:szCs w:val="32"/>
+        </w:rPr>
+        <w:t>-The knowledge falls into 2 categories:</w:t>
+      </w:r>
+    </w:p>
+    <w:p>
+      <w:pPr>
+        <w:rPr>
+          <w:sz w:val="32"/>
+          <w:szCs w:val="32"/>
+        </w:rPr>
+      </w:pPr>
+      <w:r>
+        <w:rPr>
+          <w:sz w:val="32"/>
+          <w:szCs w:val="32"/>
+        </w:rPr>
+        <w:t>+JVM performance: JVM is configured affects many aspects of program’s performance.</w:t>
+      </w:r>
+      <w:r>
+        <w:rPr>
+          <w:sz w:val="32"/>
+          <w:szCs w:val="32"/>
+        </w:rPr>
+        <w:t xml:space="preserve"> Performance of JVM is based largely on tuning flags.</w:t>
+      </w:r>
+    </w:p>
+    <w:p>
+      <w:pPr>
+        <w:rPr>
+          <w:sz w:val="32"/>
+          <w:szCs w:val="32"/>
+        </w:rPr>
+      </w:pPr>
+      <w:r>
+        <w:rPr>
+          <w:sz w:val="32"/>
+          <w:szCs w:val="32"/>
+        </w:rPr>
+        <w:t>+Understand how features of Java platforms affect performance. Some features are part of language (thread, synchronize…), some are part of Java API (string handling…). Performance of platform is determined by using best practice within code.</w:t>
+      </w:r>
+    </w:p>
+    <w:p>
+      <w:pPr>
+        <w:rPr>
+          <w:sz w:val="32"/>
+          <w:szCs w:val="32"/>
+        </w:rPr>
+      </w:pPr>
+      <w:r>
+        <w:rPr>
+          <w:sz w:val="32"/>
+          <w:szCs w:val="32"/>
+        </w:rPr>
+        <w:t>-Anyone who works with Java should ne adept at understanding how code behaves in JVM and what kinds of tuning that helps performance. Knowledge of complete sphere is what give your work the patina of art.</w:t>
+      </w:r>
     </w:p>
     <w:p>
       <w:pPr>
@@ -131,6 +205,7 @@
         <w:rPr>
           <w:color w:val="538135" w:themeColor="accent6" w:themeShade="BF"/>
         </w:rPr>
+        <w:lastRenderedPageBreak/>
         <w:t>1.3 The complete performance story</w:t>
       </w:r>
     </w:p>
@@ -280,42 +355,136 @@
         <w:rPr>
           <w:color w:val="538135" w:themeColor="accent6" w:themeShade="BF"/>
         </w:rPr>
+        <w:t>1.4 Summary</w:t>
+      </w:r>
+    </w:p>
+    <w:p>
+      <w:pPr>
+        <w:rPr>
+          <w:sz w:val="32"/>
+          <w:szCs w:val="32"/>
+        </w:rPr>
+      </w:pPr>
+    </w:p>
+    <w:p>
+      <w:pPr>
+        <w:rPr>
+          <w:sz w:val="32"/>
+          <w:szCs w:val="32"/>
+        </w:rPr>
+      </w:pPr>
+    </w:p>
+    <w:p>
+      <w:pPr>
+        <w:pStyle w:val="Heading1"/>
+        <w:rPr>
+          <w:color w:val="FF0000"/>
+          <w:sz w:val="32"/>
+          <w:szCs w:val="32"/>
+        </w:rPr>
+      </w:pPr>
+      <w:r>
+        <w:rPr>
+          <w:color w:val="FF0000"/>
+          <w:sz w:val="32"/>
+          <w:szCs w:val="32"/>
+        </w:rPr>
+        <w:t>2. An Approach to Performance Testing</w:t>
+      </w:r>
+    </w:p>
+    <w:p>
+      <w:pPr>
+        <w:rPr>
+          <w:sz w:val="32"/>
+          <w:szCs w:val="32"/>
+        </w:rPr>
+      </w:pPr>
+    </w:p>
+    <w:p>
+      <w:pPr>
+        <w:pStyle w:val="Heading2"/>
+        <w:rPr>
+          <w:color w:val="538135" w:themeColor="accent6" w:themeShade="BF"/>
+        </w:rPr>
+      </w:pPr>
+      <w:r>
+        <w:rPr>
+          <w:color w:val="538135" w:themeColor="accent6" w:themeShade="BF"/>
+        </w:rPr>
+        <w:t>2.1 Test a real application</w:t>
+      </w:r>
+    </w:p>
+    <w:p>
+      <w:pPr>
+        <w:rPr>
+          <w:sz w:val="32"/>
+          <w:szCs w:val="32"/>
+        </w:rPr>
+      </w:pPr>
+    </w:p>
+    <w:p>
+      <w:pPr>
+        <w:pStyle w:val="Heading3"/>
+        <w:rPr>
+          <w:sz w:val="32"/>
+          <w:szCs w:val="32"/>
+        </w:rPr>
+      </w:pPr>
+      <w:r>
+        <w:rPr>
+          <w:sz w:val="32"/>
+          <w:szCs w:val="32"/>
+        </w:rPr>
+        <w:t>2.1.1 Microbenchmarks</w:t>
+      </w:r>
+    </w:p>
+    <w:p>
+      <w:pPr>
+        <w:rPr>
+          <w:sz w:val="32"/>
+          <w:szCs w:val="32"/>
+        </w:rPr>
+      </w:pPr>
+    </w:p>
+    <w:p>
+      <w:pPr>
+        <w:pStyle w:val="Heading3"/>
+        <w:rPr>
+          <w:sz w:val="32"/>
+          <w:szCs w:val="32"/>
+        </w:rPr>
+      </w:pPr>
+      <w:r>
+        <w:rPr>
+          <w:sz w:val="32"/>
+          <w:szCs w:val="32"/>
+        </w:rPr>
         <w:lastRenderedPageBreak/>
-        <w:t>1.4 Summary</w:t>
-      </w:r>
-    </w:p>
-    <w:p>
-      <w:pPr>
-        <w:rPr>
-          <w:sz w:val="32"/>
-          <w:szCs w:val="32"/>
-        </w:rPr>
-      </w:pPr>
-    </w:p>
-    <w:p>
-      <w:pPr>
-        <w:rPr>
-          <w:sz w:val="32"/>
-          <w:szCs w:val="32"/>
-        </w:rPr>
-      </w:pPr>
-    </w:p>
-    <w:p>
-      <w:pPr>
-        <w:pStyle w:val="Heading1"/>
-        <w:rPr>
-          <w:color w:val="FF0000"/>
-          <w:sz w:val="32"/>
-          <w:szCs w:val="32"/>
-        </w:rPr>
-      </w:pPr>
-      <w:r>
-        <w:rPr>
-          <w:color w:val="FF0000"/>
-          <w:sz w:val="32"/>
-          <w:szCs w:val="32"/>
-        </w:rPr>
-        <w:t>2. An Approach to Performance Testing</w:t>
+        <w:t>2.1.2 Macrobenchmarks</w:t>
+      </w:r>
+    </w:p>
+    <w:p>
+      <w:pPr>
+        <w:rPr>
+          <w:sz w:val="32"/>
+          <w:szCs w:val="32"/>
+        </w:rPr>
+      </w:pPr>
+    </w:p>
+    <w:p>
+      <w:pPr>
+        <w:pStyle w:val="Heading3"/>
+        <w:rPr>
+          <w:sz w:val="32"/>
+          <w:szCs w:val="32"/>
+        </w:rPr>
+      </w:pPr>
+      <w:r>
+        <w:rPr>
+          <w:sz w:val="32"/>
+          <w:szCs w:val="32"/>
+        </w:rPr>
+        <w:t>2.1.3 Mesobenchmarks</w:t>
       </w:r>
     </w:p>
     <w:p>
@@ -337,7 +506,7 @@
         <w:rPr>
           <w:color w:val="538135" w:themeColor="accent6" w:themeShade="BF"/>
         </w:rPr>
-        <w:t>2.1 Test a real application</w:t>
+        <w:t>2.2 Understand throughput, batching, and response time</w:t>
       </w:r>
     </w:p>
     <w:p>
@@ -361,7 +530,7 @@
           <w:sz w:val="32"/>
           <w:szCs w:val="32"/>
         </w:rPr>
-        <w:t>2.1.1 Microbenchmarks</w:t>
+        <w:t>2.2.1 Elapsed Time (Batch) Measurements</w:t>
       </w:r>
     </w:p>
     <w:p>
@@ -385,17 +554,8 @@
           <w:sz w:val="32"/>
           <w:szCs w:val="32"/>
         </w:rPr>
-        <w:t xml:space="preserve">2.1.2 </w:t>
-      </w:r>
-      <w:proofErr w:type="spellStart"/>
-      <w:r>
-        <w:rPr>
-          <w:sz w:val="32"/>
-          <w:szCs w:val="32"/>
-        </w:rPr>
-        <w:t>Macrobenchmarks</w:t>
-      </w:r>
-      <w:proofErr w:type="spellEnd"/>
+        <w:t>2.2.2 Throughout Measurements</w:t>
+      </w:r>
     </w:p>
     <w:p>
       <w:pPr>
@@ -418,17 +578,8 @@
           <w:sz w:val="32"/>
           <w:szCs w:val="32"/>
         </w:rPr>
-        <w:t xml:space="preserve">2.1.3 </w:t>
-      </w:r>
-      <w:proofErr w:type="spellStart"/>
-      <w:r>
-        <w:rPr>
-          <w:sz w:val="32"/>
-          <w:szCs w:val="32"/>
-        </w:rPr>
-        <w:t>Mesobenchmarks</w:t>
-      </w:r>
-      <w:proofErr w:type="spellEnd"/>
+        <w:t>2.2.3 Response-Time Tests</w:t>
+      </w:r>
     </w:p>
     <w:p>
       <w:pPr>
@@ -449,7 +600,51 @@
         <w:rPr>
           <w:color w:val="538135" w:themeColor="accent6" w:themeShade="BF"/>
         </w:rPr>
-        <w:t>2.2 Understand throughput, batching, and response time</w:t>
+        <w:t xml:space="preserve">2.3 Understand Variability </w:t>
+      </w:r>
+    </w:p>
+    <w:p>
+      <w:pPr>
+        <w:rPr>
+          <w:sz w:val="32"/>
+          <w:szCs w:val="32"/>
+        </w:rPr>
+      </w:pPr>
+    </w:p>
+    <w:p>
+      <w:pPr>
+        <w:pStyle w:val="Heading2"/>
+        <w:rPr>
+          <w:color w:val="538135" w:themeColor="accent6" w:themeShade="BF"/>
+        </w:rPr>
+      </w:pPr>
+      <w:r>
+        <w:rPr>
+          <w:color w:val="538135" w:themeColor="accent6" w:themeShade="BF"/>
+        </w:rPr>
+        <w:t>2.4 Test Early, Test Often</w:t>
+      </w:r>
+    </w:p>
+    <w:p>
+      <w:pPr>
+        <w:rPr>
+          <w:sz w:val="32"/>
+          <w:szCs w:val="32"/>
+        </w:rPr>
+      </w:pPr>
+    </w:p>
+    <w:p>
+      <w:pPr>
+        <w:pStyle w:val="Heading2"/>
+        <w:rPr>
+          <w:color w:val="538135" w:themeColor="accent6" w:themeShade="BF"/>
+        </w:rPr>
+      </w:pPr>
+      <w:r>
+        <w:rPr>
+          <w:color w:val="538135" w:themeColor="accent6" w:themeShade="BF"/>
+        </w:rPr>
+        <w:t>2.5 Benchmark examples</w:t>
       </w:r>
     </w:p>
     <w:p>
@@ -473,7 +668,7 @@
           <w:sz w:val="32"/>
           <w:szCs w:val="32"/>
         </w:rPr>
-        <w:t>2.2.1 Elapsed Time (Batch) Measurements</w:t>
+        <w:t>2.5.1 Java Microbenchmark Harness</w:t>
       </w:r>
     </w:p>
     <w:p>
@@ -497,31 +692,7 @@
           <w:sz w:val="32"/>
           <w:szCs w:val="32"/>
         </w:rPr>
-        <w:t>2.2.2 Throughout Measurements</w:t>
-      </w:r>
-    </w:p>
-    <w:p>
-      <w:pPr>
-        <w:rPr>
-          <w:sz w:val="32"/>
-          <w:szCs w:val="32"/>
-        </w:rPr>
-      </w:pPr>
-    </w:p>
-    <w:p>
-      <w:pPr>
-        <w:pStyle w:val="Heading3"/>
-        <w:rPr>
-          <w:sz w:val="32"/>
-          <w:szCs w:val="32"/>
-        </w:rPr>
-      </w:pPr>
-      <w:r>
-        <w:rPr>
-          <w:sz w:val="32"/>
-          <w:szCs w:val="32"/>
-        </w:rPr>
-        <w:t>2.2.3 Response-Time Tests</w:t>
+        <w:t>2.5.2 Common code examples</w:t>
       </w:r>
     </w:p>
     <w:p>
@@ -544,120 +715,6 @@
           <w:color w:val="538135" w:themeColor="accent6" w:themeShade="BF"/>
         </w:rPr>
         <w:lastRenderedPageBreak/>
-        <w:t xml:space="preserve">2.3 Understand Variability </w:t>
-      </w:r>
-    </w:p>
-    <w:p>
-      <w:pPr>
-        <w:rPr>
-          <w:sz w:val="32"/>
-          <w:szCs w:val="32"/>
-        </w:rPr>
-      </w:pPr>
-    </w:p>
-    <w:p>
-      <w:pPr>
-        <w:pStyle w:val="Heading2"/>
-        <w:rPr>
-          <w:color w:val="538135" w:themeColor="accent6" w:themeShade="BF"/>
-        </w:rPr>
-      </w:pPr>
-      <w:r>
-        <w:rPr>
-          <w:color w:val="538135" w:themeColor="accent6" w:themeShade="BF"/>
-        </w:rPr>
-        <w:t>2.4 Test Early, Test Often</w:t>
-      </w:r>
-    </w:p>
-    <w:p>
-      <w:pPr>
-        <w:rPr>
-          <w:sz w:val="32"/>
-          <w:szCs w:val="32"/>
-        </w:rPr>
-      </w:pPr>
-    </w:p>
-    <w:p>
-      <w:pPr>
-        <w:pStyle w:val="Heading2"/>
-        <w:rPr>
-          <w:color w:val="538135" w:themeColor="accent6" w:themeShade="BF"/>
-        </w:rPr>
-      </w:pPr>
-      <w:r>
-        <w:rPr>
-          <w:color w:val="538135" w:themeColor="accent6" w:themeShade="BF"/>
-        </w:rPr>
-        <w:t>2.5 Benchmark examples</w:t>
-      </w:r>
-    </w:p>
-    <w:p>
-      <w:pPr>
-        <w:rPr>
-          <w:sz w:val="32"/>
-          <w:szCs w:val="32"/>
-        </w:rPr>
-      </w:pPr>
-    </w:p>
-    <w:p>
-      <w:pPr>
-        <w:pStyle w:val="Heading3"/>
-        <w:rPr>
-          <w:sz w:val="32"/>
-          <w:szCs w:val="32"/>
-        </w:rPr>
-      </w:pPr>
-      <w:r>
-        <w:rPr>
-          <w:sz w:val="32"/>
-          <w:szCs w:val="32"/>
-        </w:rPr>
-        <w:t>2.5.1 Java Microbenchmark Harness</w:t>
-      </w:r>
-    </w:p>
-    <w:p>
-      <w:pPr>
-        <w:rPr>
-          <w:sz w:val="32"/>
-          <w:szCs w:val="32"/>
-        </w:rPr>
-      </w:pPr>
-    </w:p>
-    <w:p>
-      <w:pPr>
-        <w:pStyle w:val="Heading3"/>
-        <w:rPr>
-          <w:sz w:val="32"/>
-          <w:szCs w:val="32"/>
-        </w:rPr>
-      </w:pPr>
-      <w:r>
-        <w:rPr>
-          <w:sz w:val="32"/>
-          <w:szCs w:val="32"/>
-        </w:rPr>
-        <w:t>2.5.2 Common code examples</w:t>
-      </w:r>
-    </w:p>
-    <w:p>
-      <w:pPr>
-        <w:rPr>
-          <w:sz w:val="32"/>
-          <w:szCs w:val="32"/>
-        </w:rPr>
-      </w:pPr>
-    </w:p>
-    <w:p>
-      <w:pPr>
-        <w:pStyle w:val="Heading2"/>
-        <w:rPr>
-          <w:color w:val="538135" w:themeColor="accent6" w:themeShade="BF"/>
-        </w:rPr>
-      </w:pPr>
-      <w:r>
-        <w:rPr>
-          <w:color w:val="538135" w:themeColor="accent6" w:themeShade="BF"/>
-        </w:rPr>
         <w:t>2.6 Summary</w:t>
       </w:r>
     </w:p>

</xml_diff>